<commit_message>
Improve fact-bound editorial quality
</commit_message>
<xml_diff>
--- a/sample/08-resume-editable.docx
+++ b/sample/08-resume-editable.docx
@@ -61,7 +61,37 @@
           <w:color w:val="1E3A5F"/>
           <w:sz w:val="23"/>
         </w:rPr>
-        <w:t>个人优势</w:t>
+        <w:t>岗位相关概述</w:t>
+      </w:r>
+    </w:p>
+    <w:p>
+      <w:pPr>
+        <w:spacing w:after="60"/>
+      </w:pPr>
+      <w:r>
+        <w:rPr>
+          <w:rFonts w:ascii="LXGW WenKai" w:hAnsi="LXGW WenKai" w:eastAsia="LXGW WenKai"/>
+          <w:b w:val="0"/>
+          <w:sz w:val="19"/>
+        </w:rPr>
+        <w:t>具备Excel数据分析、跨团队沟通、商品上架与活动策划等能力；已有连续8周整理经营数据并输出复盘；协助策划3次促销活动等可核验经历。</w:t>
+      </w:r>
+    </w:p>
+    <w:p>
+      <w:pPr>
+        <w:spacing w:before="140" w:after="60"/>
+        <w:pBdr>
+          <w:bottom w:val="single" w:sz="8" w:space="2" w:color="15803D"/>
+        </w:pBdr>
+      </w:pPr>
+      <w:r>
+        <w:rPr>
+          <w:rFonts w:ascii="LXGW WenKai" w:hAnsi="LXGW WenKai" w:eastAsia="LXGW WenKai"/>
+          <w:b/>
+          <w:color w:val="1E3A5F"/>
+          <w:sz w:val="23"/>
+        </w:rPr>
+        <w:t>核心能力</w:t>
       </w:r>
     </w:p>
     <w:p>
@@ -91,7 +121,7 @@
           <w:b w:val="0"/>
           <w:sz w:val="19"/>
         </w:rPr>
-        <w:t>商品上架与活动策划</w:t>
+        <w:t>跨团队沟通</w:t>
       </w:r>
     </w:p>
     <w:p>
@@ -106,7 +136,7 @@
           <w:b w:val="0"/>
           <w:sz w:val="19"/>
         </w:rPr>
-        <w:t>跨团队沟通</w:t>
+        <w:t>商品上架与活动策划</w:t>
       </w:r>
     </w:p>
     <w:p>
@@ -123,7 +153,7 @@
           <w:color w:val="1E3A5F"/>
           <w:sz w:val="23"/>
         </w:rPr>
-        <w:t>经历</w:t>
+        <w:t>相关经历</w:t>
       </w:r>
     </w:p>
     <w:p>
@@ -138,7 +168,7 @@
           <w:b w:val="0"/>
           <w:sz w:val="19"/>
         </w:rPr>
-        <w:t>维护120个商品的信息准确性</w:t>
+        <w:t>连续8周整理经营数据并输出复盘</w:t>
       </w:r>
     </w:p>
     <w:p>
@@ -168,7 +198,7 @@
           <w:b w:val="0"/>
           <w:sz w:val="19"/>
         </w:rPr>
-        <w:t>连续8周整理经营数据并输出复盘</w:t>
+        <w:t>维护120个商品的信息准确性</w:t>
       </w:r>
     </w:p>
     <w:sectPr>

</xml_diff>